<commit_message>
Netlify etkileşimli sunum sayfası ve rapora site linki
Co-Authored-By: Claude Opus 5.5 <noreply@anthropic.com>
</commit_message>
<xml_diff>
--- a/proje_raporu.docx
+++ b/proje_raporu.docx
@@ -349,7 +349,7 @@
         </w:rPr>
         <w:t xml:space="preserve">Kod (GitHub): </w:t>
       </w:r>
-      <w:hyperlink w:history="1" r:id="rIdmjtf9dj0knsap2gpeqrsk">
+      <w:hyperlink w:history="1" r:id="rIdzo8buf7iyy92hcmdwxd-w">
         <w:r>
           <w:rPr>
             <w:rFonts w:ascii="Calibri" w:cs="Calibri" w:eastAsia="Calibri" w:hAnsi="Calibri"/>
@@ -376,7 +376,7 @@
         </w:rPr>
         <w:t xml:space="preserve">Notebook (Colab): </w:t>
       </w:r>
-      <w:hyperlink w:history="1" r:id="rIdhpor5htikfagqvrit8is9">
+      <w:hyperlink w:history="1" r:id="rIdkryzt4w1wniziopnmmcr7">
         <w:r>
           <w:rPr>
             <w:rFonts w:ascii="Calibri" w:cs="Calibri" w:eastAsia="Calibri" w:hAnsi="Calibri"/>
@@ -391,7 +391,7 @@
     </w:p>
     <w:p>
       <w:pPr>
-        <w:spacing w:after="60"/>
+        <w:spacing w:after="20"/>
       </w:pPr>
       <w:r>
         <w:rPr>
@@ -403,7 +403,7 @@
         </w:rPr>
         <w:t xml:space="preserve">Veri kaynağı: </w:t>
       </w:r>
-      <w:hyperlink w:history="1" r:id="rId99y2nnlpnyybd_eyr2l_s">
+      <w:hyperlink w:history="1" r:id="rIdjfgxleeqiesqowrvxid8h">
         <w:r>
           <w:rPr>
             <w:rFonts w:ascii="Calibri" w:cs="Calibri" w:eastAsia="Calibri" w:hAnsi="Calibri"/>
@@ -413,6 +413,33 @@
             <w:u w:val="single"/>
           </w:rPr>
           <w:t xml:space="preserve">https://archive.ics.uci.edu/dataset/17/breast+cancer+wisconsin+diagnostic</w:t>
+        </w:r>
+      </w:hyperlink>
+    </w:p>
+    <w:p>
+      <w:pPr>
+        <w:spacing w:after="60"/>
+      </w:pPr>
+      <w:r>
+        <w:rPr>
+          <w:rFonts w:ascii="Calibri" w:cs="Calibri" w:eastAsia="Calibri" w:hAnsi="Calibri"/>
+          <w:b/>
+          <w:bCs/>
+          <w:sz w:val="18"/>
+          <w:szCs w:val="18"/>
+        </w:rPr>
+        <w:t xml:space="preserve">Etkileşimli sunum (Netlify): </w:t>
+      </w:r>
+      <w:hyperlink w:history="1" r:id="rIdhxhijdwd7csx8u5z5qhlm">
+        <w:r>
+          <w:rPr>
+            <w:rFonts w:ascii="Calibri" w:cs="Calibri" w:eastAsia="Calibri" w:hAnsi="Calibri"/>
+            <w:color w:val="1D4ED8"/>
+            <w:sz w:val="18"/>
+            <w:szCs w:val="18"/>
+            <w:u w:val="single"/>
+          </w:rPr>
+          <w:t xml:space="preserve">https://meme-kanseri-ml.netlify.app</w:t>
         </w:r>
       </w:hyperlink>
     </w:p>
@@ -1068,80 +1095,6 @@
                   <wp:extent cx="2571750" cy="1676400"/>
                   <wp:effectExtent t="0" r="0" b="0" l="0"/>
                   <wp:docPr id="1" name="1_sinif_dagilimi.png" descr="1_sinif_dagilimi.png" title="1_sinif_dagilimi.png"/>
-                  <wp:cNvGraphicFramePr>
-                    <a:graphicFrameLocks xmlns:a="http://schemas.openxmlformats.org/drawingml/2006/main" noChangeAspect="1"/>
-                  </wp:cNvGraphicFramePr>
-                  <a:graphic xmlns:a="http://schemas.openxmlformats.org/drawingml/2006/main">
-                    <a:graphicData uri="http://schemas.openxmlformats.org/drawingml/2006/picture">
-                      <pic:pic xmlns:pic="http://schemas.openxmlformats.org/drawingml/2006/picture">
-                        <pic:nvPicPr>
-                          <pic:cNvPr id="0" name="" descr=""/>
-                          <pic:cNvPicPr>
-                            <a:picLocks noChangeAspect="1" noChangeArrowheads="1"/>
-                          </pic:cNvPicPr>
-                        </pic:nvPicPr>
-                        <pic:blipFill>
-                          <a:blip r:embed="rId11" cstate="none"/>
-                          <a:srcRect/>
-                          <a:stretch>
-                            <a:fillRect/>
-                          </a:stretch>
-                        </pic:blipFill>
-                        <pic:spPr bwMode="auto">
-                          <a:xfrm>
-                            <a:off x="0" y="0"/>
-                            <a:ext cx="2571750" cy="1676400"/>
-                          </a:xfrm>
-                          <a:prstGeom prst="rect">
-                            <a:avLst/>
-                          </a:prstGeom>
-                        </pic:spPr>
-                      </pic:pic>
-                    </a:graphicData>
-                  </a:graphic>
-                </wp:inline>
-              </w:drawing>
-            </w:r>
-          </w:p>
-          <w:p>
-            <w:pPr>
-              <w:spacing w:after="120" w:before="30"/>
-              <w:jc w:val="center"/>
-            </w:pPr>
-            <w:r>
-              <w:rPr>
-                <w:rFonts w:ascii="Calibri" w:cs="Calibri" w:eastAsia="Calibri" w:hAnsi="Calibri"/>
-                <w:i/>
-                <w:iCs/>
-                <w:color w:val="57534E"/>
-                <w:sz w:val="16"/>
-                <w:szCs w:val="16"/>
-              </w:rPr>
-              <w:t xml:space="preserve">Şekil 1. Sınıf dağılımı</w:t>
-            </w:r>
-          </w:p>
-        </w:tc>
-        <w:tc>
-          <w:tcPr>
-            <w:tcW w:type="dxa" w:w="4800"/>
-            <w:tcBorders>
-              <w:top w:val="none" w:color="FFFFFF" w:sz="0"/>
-              <w:left w:val="none" w:color="FFFFFF" w:sz="0"/>
-              <w:bottom w:val="none" w:color="FFFFFF" w:sz="0"/>
-              <w:right w:val="none" w:color="FFFFFF" w:sz="0"/>
-            </w:tcBorders>
-            <w:vAlign w:val="bottom"/>
-          </w:tcPr>
-          <w:p>
-            <w:pPr>
-              <w:jc w:val="center"/>
-            </w:pPr>
-            <w:r>
-              <w:drawing>
-                <wp:inline distT="0" distB="0" distL="0" distR="0">
-                  <wp:extent cx="2476500" cy="2028825"/>
-                  <wp:effectExtent t="0" r="0" b="0" l="0"/>
-                  <wp:docPr id="2" name="3_korelasyon.png" descr="3_korelasyon.png" title="3_korelasyon.png"/>
                   <wp:cNvGraphicFramePr>
                     <a:graphicFrameLocks xmlns:a="http://schemas.openxmlformats.org/drawingml/2006/main" noChangeAspect="1"/>
                   </wp:cNvGraphicFramePr>
@@ -1164,6 +1117,80 @@
                         <pic:spPr bwMode="auto">
                           <a:xfrm>
                             <a:off x="0" y="0"/>
+                            <a:ext cx="2571750" cy="1676400"/>
+                          </a:xfrm>
+                          <a:prstGeom prst="rect">
+                            <a:avLst/>
+                          </a:prstGeom>
+                        </pic:spPr>
+                      </pic:pic>
+                    </a:graphicData>
+                  </a:graphic>
+                </wp:inline>
+              </w:drawing>
+            </w:r>
+          </w:p>
+          <w:p>
+            <w:pPr>
+              <w:spacing w:after="120" w:before="30"/>
+              <w:jc w:val="center"/>
+            </w:pPr>
+            <w:r>
+              <w:rPr>
+                <w:rFonts w:ascii="Calibri" w:cs="Calibri" w:eastAsia="Calibri" w:hAnsi="Calibri"/>
+                <w:i/>
+                <w:iCs/>
+                <w:color w:val="57534E"/>
+                <w:sz w:val="16"/>
+                <w:szCs w:val="16"/>
+              </w:rPr>
+              <w:t xml:space="preserve">Şekil 1. Sınıf dağılımı</w:t>
+            </w:r>
+          </w:p>
+        </w:tc>
+        <w:tc>
+          <w:tcPr>
+            <w:tcW w:type="dxa" w:w="4800"/>
+            <w:tcBorders>
+              <w:top w:val="none" w:color="FFFFFF" w:sz="0"/>
+              <w:left w:val="none" w:color="FFFFFF" w:sz="0"/>
+              <w:bottom w:val="none" w:color="FFFFFF" w:sz="0"/>
+              <w:right w:val="none" w:color="FFFFFF" w:sz="0"/>
+            </w:tcBorders>
+            <w:vAlign w:val="bottom"/>
+          </w:tcPr>
+          <w:p>
+            <w:pPr>
+              <w:jc w:val="center"/>
+            </w:pPr>
+            <w:r>
+              <w:drawing>
+                <wp:inline distT="0" distB="0" distL="0" distR="0">
+                  <wp:extent cx="2476500" cy="2028825"/>
+                  <wp:effectExtent t="0" r="0" b="0" l="0"/>
+                  <wp:docPr id="2" name="3_korelasyon.png" descr="3_korelasyon.png" title="3_korelasyon.png"/>
+                  <wp:cNvGraphicFramePr>
+                    <a:graphicFrameLocks xmlns:a="http://schemas.openxmlformats.org/drawingml/2006/main" noChangeAspect="1"/>
+                  </wp:cNvGraphicFramePr>
+                  <a:graphic xmlns:a="http://schemas.openxmlformats.org/drawingml/2006/main">
+                    <a:graphicData uri="http://schemas.openxmlformats.org/drawingml/2006/picture">
+                      <pic:pic xmlns:pic="http://schemas.openxmlformats.org/drawingml/2006/picture">
+                        <pic:nvPicPr>
+                          <pic:cNvPr id="0" name="" descr=""/>
+                          <pic:cNvPicPr>
+                            <a:picLocks noChangeAspect="1" noChangeArrowheads="1"/>
+                          </pic:cNvPicPr>
+                        </pic:nvPicPr>
+                        <pic:blipFill>
+                          <a:blip r:embed="rId13" cstate="none"/>
+                          <a:srcRect/>
+                          <a:stretch>
+                            <a:fillRect/>
+                          </a:stretch>
+                        </pic:blipFill>
+                        <pic:spPr bwMode="auto">
+                          <a:xfrm>
+                            <a:off x="0" y="0"/>
                             <a:ext cx="2476500" cy="2028825"/>
                           </a:xfrm>
                           <a:prstGeom prst="rect">
@@ -1221,7 +1248,7 @@
                     </pic:cNvPicPr>
                   </pic:nvPicPr>
                   <pic:blipFill>
-                    <a:blip r:embed="rId13" cstate="none"/>
+                    <a:blip r:embed="rId14" cstate="none"/>
                     <a:srcRect/>
                     <a:stretch>
                       <a:fillRect/>
@@ -3146,7 +3173,7 @@
                           </pic:cNvPicPr>
                         </pic:nvPicPr>
                         <pic:blipFill>
-                          <a:blip r:embed="rId14" cstate="none"/>
+                          <a:blip r:embed="rId15" cstate="none"/>
                           <a:srcRect/>
                           <a:stretch>
                             <a:fillRect/>
@@ -3220,7 +3247,7 @@
                           </pic:cNvPicPr>
                         </pic:nvPicPr>
                         <pic:blipFill>
-                          <a:blip r:embed="rId15" cstate="none"/>
+                          <a:blip r:embed="rId16" cstate="none"/>
                           <a:srcRect/>
                           <a:stretch>
                             <a:fillRect/>
@@ -3286,7 +3313,7 @@
                     </pic:cNvPicPr>
                   </pic:nvPicPr>
                   <pic:blipFill>
-                    <a:blip r:embed="rId16" cstate="none"/>
+                    <a:blip r:embed="rId17" cstate="none"/>
                     <a:srcRect/>
                     <a:stretch>
                       <a:fillRect/>

</xml_diff>